<commit_message>
Add CRCcard new Template and CRCcard
</commit_message>
<xml_diff>
--- a/Documentation/Analysis/Modeling/Structural Models/CRC/CRCCardTemplate.docx
+++ b/Documentation/Analysis/Modeling/Structural Models/CRC/CRCCardTemplate.docx
@@ -11,8 +11,7 @@
         <w:tblLook w:val="04A0" w:firstRow="1" w:lastRow="0" w:firstColumn="1" w:lastColumn="0" w:noHBand="0" w:noVBand="1"/>
       </w:tblPr>
       <w:tblGrid>
-        <w:gridCol w:w="2580"/>
-        <w:gridCol w:w="679"/>
+        <w:gridCol w:w="3259"/>
         <w:gridCol w:w="2411"/>
         <w:gridCol w:w="1279"/>
         <w:gridCol w:w="4403"/>
@@ -21,28 +20,61 @@
         <w:tc>
           <w:tcPr>
             <w:tcW w:w="11352" w:type="dxa"/>
-            <w:gridSpan w:val="5"/>
+            <w:gridSpan w:val="4"/>
+            <w:shd w:val="clear" w:color="auto" w:fill="222A35" w:themeFill="text2" w:themeFillShade="80"/>
           </w:tcPr>
           <w:p>
             <w:pPr>
               <w:bidi/>
               <w:rPr>
-                <w:rFonts w:cs="Mj_Casablanca Light"/>
+                <w:rFonts w:ascii="Zain" w:hAnsi="Zain" w:cs="Zain"/>
+                <w:b/>
+                <w:bCs/>
                 <w:color w:val="ED7D31" w:themeColor="accent2"/>
                 <w:sz w:val="32"/>
                 <w:szCs w:val="32"/>
                 <w:rtl/>
+                <w:lang w:bidi="fa-IR"/>
               </w:rPr>
             </w:pPr>
             <w:r>
               <w:rPr>
-                <w:rFonts w:cs="Mj_Casablanca Light" w:hint="cs"/>
+                <w:rFonts w:ascii="Zain" w:hAnsi="Zain" w:cs="Zain"/>
+                <w:b/>
+                <w:bCs/>
                 <w:color w:val="ED7D31" w:themeColor="accent2"/>
                 <w:sz w:val="32"/>
                 <w:szCs w:val="32"/>
                 <w:rtl/>
-              </w:rPr>
-              <w:t>روي كارت :</w:t>
+                <w:lang w:bidi="fa-IR"/>
+              </w:rPr>
+              <w:t>رو</w:t>
+            </w:r>
+            <w:r>
+              <w:rPr>
+                <w:rFonts w:ascii="Zain" w:hAnsi="Zain" w:cs="Zain"/>
+                <w:b/>
+                <w:bCs/>
+                <w:color w:val="ED7D31" w:themeColor="accent2"/>
+                <w:sz w:val="32"/>
+                <w:szCs w:val="32"/>
+                <w:rtl/>
+                <w:lang w:bidi="fa-IR"/>
+              </w:rPr>
+              <w:t>ی</w:t>
+            </w:r>
+            <w:r>
+              <w:rPr>
+                <w:rFonts w:ascii="Zain" w:hAnsi="Zain" w:cs="Zain"/>
+                <w:b/>
+                <w:bCs/>
+                <w:color w:val="ED7D31" w:themeColor="accent2"/>
+                <w:sz w:val="32"/>
+                <w:szCs w:val="32"/>
+                <w:rtl/>
+                <w:lang w:bidi="fa-IR"/>
+              </w:rPr>
+              <w:t xml:space="preserve"> كارت :</w:t>
             </w:r>
           </w:p>
         </w:tc>
@@ -51,24 +83,35 @@
         <w:tc>
           <w:tcPr>
             <w:tcW w:w="3259" w:type="dxa"/>
-            <w:gridSpan w:val="2"/>
           </w:tcPr>
           <w:p>
             <w:pPr>
               <w:bidi/>
               <w:rPr>
-                <w:rFonts w:cs="Mj_Casablanca Light"/>
-                <w:color w:val="0070C0"/>
-                <w:rtl/>
+                <w:rFonts w:ascii="Zain" w:hAnsi="Zain" w:cs="Zain"/>
+                <w:color w:val="0070C0"/>
+                <w:rtl/>
+                <w:lang w:bidi="fa-IR"/>
               </w:rPr>
             </w:pPr>
             <w:r>
               <w:rPr>
-                <w:rFonts w:cs="Mj_Casablanca Light" w:hint="cs"/>
-                <w:color w:val="0070C0"/>
-                <w:rtl/>
+                <w:rFonts w:ascii="Zain" w:hAnsi="Zain" w:cs="Zain"/>
+                <w:b/>
+                <w:bCs/>
+                <w:color w:val="0070C0"/>
+                <w:rtl/>
+                <w:lang w:bidi="fa-IR"/>
               </w:rPr>
               <w:t>نام كلاس :</w:t>
+            </w:r>
+            <w:r>
+              <w:rPr>
+                <w:rFonts w:ascii="Zain" w:hAnsi="Zain" w:cs="Zain"/>
+                <w:color w:val="0070C0"/>
+                <w:lang w:bidi="fa-IR"/>
+              </w:rPr>
+              <w:t xml:space="preserve"> </w:t>
             </w:r>
           </w:p>
         </w:tc>
@@ -81,18 +124,89 @@
             <w:pPr>
               <w:bidi/>
               <w:rPr>
-                <w:rFonts w:cs="Mj_Casablanca Light"/>
-                <w:color w:val="0070C0"/>
-                <w:rtl/>
+                <w:rFonts w:ascii="Zain" w:hAnsi="Zain" w:cs="Zain"/>
+                <w:b/>
+                <w:bCs/>
+                <w:color w:val="0070C0"/>
+                <w:lang w:bidi="fa-IR"/>
               </w:rPr>
             </w:pPr>
             <w:r>
               <w:rPr>
-                <w:rFonts w:cs="Mj_Casablanca Light" w:hint="cs"/>
-                <w:color w:val="0070C0"/>
-                <w:rtl/>
-              </w:rPr>
-              <w:t>شماره‌ي شناسايي :</w:t>
+                <w:rFonts w:ascii="Zain" w:hAnsi="Zain" w:cs="Zain"/>
+                <w:b/>
+                <w:bCs/>
+                <w:color w:val="0070C0"/>
+                <w:rtl/>
+                <w:lang w:bidi="fa-IR"/>
+              </w:rPr>
+              <w:t>شماره</w:t>
+            </w:r>
+            <w:r>
+              <w:rPr>
+                <w:rFonts w:ascii="Times New Roman" w:hAnsi="Times New Roman" w:cs="Times New Roman"/>
+                <w:b/>
+                <w:bCs/>
+                <w:color w:val="0070C0"/>
+                <w:rtl/>
+                <w:lang w:bidi="fa-IR"/>
+              </w:rPr>
+              <w:t>‌</w:t>
+            </w:r>
+            <w:r>
+              <w:rPr>
+                <w:rFonts w:ascii="Zain" w:hAnsi="Zain" w:cs="Zain" w:hint="cs"/>
+                <w:b/>
+                <w:bCs/>
+                <w:color w:val="0070C0"/>
+                <w:rtl/>
+                <w:lang w:bidi="fa-IR"/>
+              </w:rPr>
+              <w:t>ی</w:t>
+            </w:r>
+            <w:r>
+              <w:rPr>
+                <w:rFonts w:ascii="Zain" w:hAnsi="Zain" w:cs="Zain"/>
+                <w:b/>
+                <w:bCs/>
+                <w:color w:val="0070C0"/>
+                <w:rtl/>
+                <w:lang w:bidi="fa-IR"/>
+              </w:rPr>
+              <w:t xml:space="preserve"> شناسا</w:t>
+            </w:r>
+            <w:r>
+              <w:rPr>
+                <w:rFonts w:ascii="Zain" w:hAnsi="Zain" w:cs="Zain"/>
+                <w:b/>
+                <w:bCs/>
+                <w:color w:val="0070C0"/>
+                <w:rtl/>
+                <w:lang w:bidi="fa-IR"/>
+              </w:rPr>
+              <w:t>یی</w:t>
+            </w:r>
+            <w:r>
+              <w:rPr>
+                <w:rFonts w:ascii="Zain" w:hAnsi="Zain" w:cs="Zain"/>
+                <w:b/>
+                <w:bCs/>
+                <w:color w:val="0070C0"/>
+                <w:rtl/>
+                <w:lang w:bidi="fa-IR"/>
+              </w:rPr>
+              <w:t xml:space="preserve"> :</w:t>
+            </w:r>
+            <w:r>
+              <w:rPr>
+                <w:rFonts w:ascii="Zain" w:hAnsi="Zain" w:cs="Zain" w:hint="cs"/>
+                <w:b/>
+                <w:bCs/>
+                <w:color w:val="0070C0"/>
+                <w:rtl/>
+                <w:lang w:bidi="fa-IR"/>
+              </w:rPr>
+              <w:t xml:space="preserve"> </w:t>
             </w:r>
           </w:p>
         </w:tc>
@@ -104,16 +218,22 @@
             <w:pPr>
               <w:bidi/>
               <w:rPr>
-                <w:rFonts w:cs="Mj_Casablanca Light"/>
-                <w:color w:val="0070C0"/>
-                <w:rtl/>
+                <w:rFonts w:ascii="Zain" w:hAnsi="Zain" w:cs="Zain"/>
+                <w:b/>
+                <w:bCs/>
+                <w:color w:val="0070C0"/>
+                <w:rtl/>
+                <w:lang w:bidi="fa-IR"/>
               </w:rPr>
             </w:pPr>
             <w:r>
               <w:rPr>
-                <w:rFonts w:cs="Mj_Casablanca Light" w:hint="cs"/>
-                <w:color w:val="0070C0"/>
-                <w:rtl/>
+                <w:rFonts w:ascii="Zain" w:hAnsi="Zain" w:cs="Zain"/>
+                <w:b/>
+                <w:bCs/>
+                <w:color w:val="0070C0"/>
+                <w:rtl/>
+                <w:lang w:bidi="fa-IR"/>
               </w:rPr>
               <w:t>نوع :</w:t>
             </w:r>
@@ -124,24 +244,37 @@
         <w:tc>
           <w:tcPr>
             <w:tcW w:w="6949" w:type="dxa"/>
-            <w:gridSpan w:val="4"/>
+            <w:gridSpan w:val="3"/>
           </w:tcPr>
           <w:p>
             <w:pPr>
               <w:bidi/>
               <w:rPr>
-                <w:rFonts w:cs="Mj_Casablanca Light"/>
-                <w:color w:val="0070C0"/>
-                <w:rtl/>
+                <w:rFonts w:ascii="Zain" w:hAnsi="Zain" w:cs="Zain"/>
+                <w:color w:val="0070C0"/>
+                <w:rtl/>
+                <w:lang w:bidi="fa-IR"/>
               </w:rPr>
             </w:pPr>
             <w:r>
               <w:rPr>
-                <w:rFonts w:cs="Mj_Casablanca Light" w:hint="cs"/>
-                <w:color w:val="0070C0"/>
-                <w:rtl/>
+                <w:rFonts w:ascii="Zain" w:hAnsi="Zain" w:cs="Zain"/>
+                <w:b/>
+                <w:bCs/>
+                <w:color w:val="0070C0"/>
+                <w:rtl/>
+                <w:lang w:bidi="fa-IR"/>
               </w:rPr>
               <w:t>شرح :</w:t>
+            </w:r>
+            <w:r>
+              <w:rPr>
+                <w:rFonts w:ascii="Zain" w:hAnsi="Zain" w:cs="Zain"/>
+                <w:color w:val="0070C0"/>
+                <w:rtl/>
+                <w:lang w:bidi="fa-IR"/>
+              </w:rPr>
+              <w:t xml:space="preserve"> </w:t>
             </w:r>
           </w:p>
         </w:tc>
@@ -153,19 +286,78 @@
             <w:pPr>
               <w:bidi/>
               <w:rPr>
-                <w:rFonts w:cs="Mj_Casablanca Light"/>
-                <w:color w:val="0070C0"/>
-                <w:rtl/>
+                <w:rFonts w:ascii="Zain" w:hAnsi="Zain" w:cs="Zain"/>
+                <w:b/>
+                <w:bCs/>
+                <w:color w:val="0070C0"/>
+                <w:lang w:bidi="fa-IR"/>
               </w:rPr>
             </w:pPr>
             <w:r>
               <w:rPr>
-                <w:rFonts w:cs="Mj_Casablanca Light" w:hint="cs"/>
-                <w:color w:val="0070C0"/>
-                <w:rtl/>
-              </w:rPr>
-              <w:t>مورد-كاربردي مرتبط :</w:t>
-            </w:r>
+                <w:rFonts w:ascii="Zain" w:hAnsi="Zain" w:cs="Zain"/>
+                <w:b/>
+                <w:bCs/>
+                <w:color w:val="0070C0"/>
+                <w:rtl/>
+                <w:lang w:bidi="fa-IR"/>
+              </w:rPr>
+              <w:t>مورد-كاربرد</w:t>
+            </w:r>
+            <w:r>
+              <w:rPr>
+                <w:rFonts w:ascii="Zain" w:hAnsi="Zain" w:cs="Zain"/>
+                <w:b/>
+                <w:bCs/>
+                <w:color w:val="0070C0"/>
+                <w:rtl/>
+                <w:lang w:bidi="fa-IR"/>
+              </w:rPr>
+              <w:t>ی</w:t>
+            </w:r>
+            <w:r>
+              <w:rPr>
+                <w:rFonts w:ascii="Zain" w:hAnsi="Zain" w:cs="Zain"/>
+                <w:b/>
+                <w:bCs/>
+                <w:color w:val="0070C0"/>
+                <w:rtl/>
+                <w:lang w:bidi="fa-IR"/>
+              </w:rPr>
+              <w:t xml:space="preserve"> مرتبط :</w:t>
+            </w:r>
+          </w:p>
+          <w:p>
+            <w:pPr>
+              <w:rPr>
+                <w:rFonts w:ascii="Zain" w:hAnsi="Zain" w:cs="Zain"/>
+                <w:b/>
+                <w:bCs/>
+                <w:color w:val="0070C0"/>
+                <w:lang w:bidi="fa-IR"/>
+              </w:rPr>
+            </w:pPr>
+            <w:r>
+              <w:rPr>
+                <w:rFonts w:ascii="Zain" w:hAnsi="Zain" w:cs="Zain"/>
+                <w:b/>
+                <w:bCs/>
+                <w:lang w:bidi="fa-IR"/>
+              </w:rPr>
+              <w:t xml:space="preserve">UC _ </w:t>
+            </w:r>
+          </w:p>
+          <w:p>
+            <w:pPr>
+              <w:rPr>
+                <w:rFonts w:ascii="Zain" w:hAnsi="Zain" w:cs="Zain"/>
+                <w:b/>
+                <w:bCs/>
+                <w:color w:val="0070C0"/>
+                <w:rtl/>
+                <w:lang w:bidi="fa-IR"/>
+              </w:rPr>
+            </w:pPr>
           </w:p>
         </w:tc>
       </w:tr>
@@ -173,7 +365,7 @@
         <w:tc>
           <w:tcPr>
             <w:tcW w:w="5670" w:type="dxa"/>
-            <w:gridSpan w:val="3"/>
+            <w:gridSpan w:val="2"/>
             <w:vAlign w:val="center"/>
           </w:tcPr>
           <w:p>
@@ -181,18 +373,46 @@
               <w:bidi/>
               <w:jc w:val="center"/>
               <w:rPr>
-                <w:rFonts w:cs="Mj_Casablanca Light"/>
-                <w:color w:val="0070C0"/>
-                <w:rtl/>
+                <w:rFonts w:ascii="Zain" w:hAnsi="Zain" w:cs="Zain"/>
+                <w:b/>
+                <w:bCs/>
+                <w:color w:val="0070C0"/>
+                <w:rtl/>
+                <w:lang w:bidi="fa-IR"/>
               </w:rPr>
             </w:pPr>
             <w:r>
               <w:rPr>
-                <w:rFonts w:cs="Mj_Casablanca Light" w:hint="cs"/>
-                <w:color w:val="0070C0"/>
-                <w:rtl/>
-              </w:rPr>
-              <w:t>مسئوليت ها</w:t>
+                <w:rFonts w:ascii="Zain" w:hAnsi="Zain" w:cs="Zain"/>
+                <w:b/>
+                <w:bCs/>
+                <w:color w:val="0070C0"/>
+                <w:rtl/>
+                <w:lang w:bidi="fa-IR"/>
+              </w:rPr>
+              <w:t>مسئول</w:t>
+            </w:r>
+            <w:r>
+              <w:rPr>
+                <w:rFonts w:ascii="Zain" w:hAnsi="Zain" w:cs="Zain"/>
+                <w:b/>
+                <w:bCs/>
+                <w:color w:val="0070C0"/>
+                <w:rtl/>
+                <w:lang w:bidi="fa-IR"/>
+              </w:rPr>
+              <w:t>ی</w:t>
+            </w:r>
+            <w:r>
+              <w:rPr>
+                <w:rFonts w:ascii="Zain" w:hAnsi="Zain" w:cs="Zain"/>
+                <w:b/>
+                <w:bCs/>
+                <w:color w:val="0070C0"/>
+                <w:rtl/>
+                <w:lang w:bidi="fa-IR"/>
+              </w:rPr>
+              <w:t>ت ها</w:t>
             </w:r>
           </w:p>
         </w:tc>
@@ -207,18 +427,46 @@
               <w:bidi/>
               <w:jc w:val="center"/>
               <w:rPr>
-                <w:rFonts w:cs="Mj_Casablanca Light"/>
-                <w:color w:val="0070C0"/>
-                <w:rtl/>
+                <w:rFonts w:ascii="Zain" w:hAnsi="Zain" w:cs="Zain"/>
+                <w:b/>
+                <w:bCs/>
+                <w:color w:val="0070C0"/>
+                <w:rtl/>
+                <w:lang w:bidi="fa-IR"/>
               </w:rPr>
             </w:pPr>
             <w:r>
               <w:rPr>
-                <w:rFonts w:cs="Mj_Casablanca Light" w:hint="cs"/>
-                <w:color w:val="0070C0"/>
-                <w:rtl/>
-              </w:rPr>
-              <w:t>همكاري ها</w:t>
+                <w:rFonts w:ascii="Zain" w:hAnsi="Zain" w:cs="Zain"/>
+                <w:b/>
+                <w:bCs/>
+                <w:color w:val="0070C0"/>
+                <w:rtl/>
+                <w:lang w:bidi="fa-IR"/>
+              </w:rPr>
+              <w:t>همكار</w:t>
+            </w:r>
+            <w:r>
+              <w:rPr>
+                <w:rFonts w:ascii="Zain" w:hAnsi="Zain" w:cs="Zain"/>
+                <w:b/>
+                <w:bCs/>
+                <w:color w:val="0070C0"/>
+                <w:rtl/>
+                <w:lang w:bidi="fa-IR"/>
+              </w:rPr>
+              <w:t>ی</w:t>
+            </w:r>
+            <w:r>
+              <w:rPr>
+                <w:rFonts w:ascii="Zain" w:hAnsi="Zain" w:cs="Zain"/>
+                <w:b/>
+                <w:bCs/>
+                <w:color w:val="0070C0"/>
+                <w:rtl/>
+                <w:lang w:bidi="fa-IR"/>
+              </w:rPr>
+              <w:t xml:space="preserve"> ها</w:t>
             </w:r>
           </w:p>
         </w:tc>
@@ -227,15 +475,16 @@
         <w:tc>
           <w:tcPr>
             <w:tcW w:w="5670" w:type="dxa"/>
-            <w:gridSpan w:val="3"/>
+            <w:gridSpan w:val="2"/>
           </w:tcPr>
           <w:p>
             <w:pPr>
               <w:bidi/>
-              <w:rPr>
-                <w:rFonts w:cs="Mj_Casablanca Light"/>
-                <w:color w:val="0070C0"/>
-                <w:rtl/>
+              <w:jc w:val="center"/>
+              <w:rPr>
+                <w:rFonts w:ascii="Zain" w:hAnsi="Zain" w:cs="Zain"/>
+                <w:rtl/>
+                <w:lang w:bidi="fa-IR"/>
               </w:rPr>
             </w:pPr>
           </w:p>
@@ -248,10 +497,11 @@
           <w:p>
             <w:pPr>
               <w:bidi/>
-              <w:rPr>
-                <w:rFonts w:cs="Mj_Casablanca Light"/>
-                <w:color w:val="0070C0"/>
-                <w:rtl/>
+              <w:jc w:val="center"/>
+              <w:rPr>
+                <w:rFonts w:ascii="Zain" w:hAnsi="Zain" w:cs="Zain"/>
+                <w:rtl/>
+                <w:lang w:bidi="fa-IR"/>
               </w:rPr>
             </w:pPr>
           </w:p>
@@ -261,15 +511,15 @@
         <w:tc>
           <w:tcPr>
             <w:tcW w:w="5670" w:type="dxa"/>
-            <w:gridSpan w:val="3"/>
+            <w:gridSpan w:val="2"/>
           </w:tcPr>
           <w:p>
             <w:pPr>
               <w:bidi/>
-              <w:rPr>
-                <w:rFonts w:cs="Mj_Casablanca Light"/>
-                <w:color w:val="0070C0"/>
-                <w:rtl/>
+              <w:jc w:val="center"/>
+              <w:rPr>
+                <w:rFonts w:ascii="Zain" w:hAnsi="Zain" w:cs="Zain"/>
+                <w:lang w:bidi="fa-IR"/>
               </w:rPr>
             </w:pPr>
           </w:p>
@@ -282,74 +532,68 @@
           <w:p>
             <w:pPr>
               <w:bidi/>
-              <w:rPr>
-                <w:rFonts w:cs="Mj_Casablanca Light"/>
-                <w:color w:val="0070C0"/>
-                <w:rtl/>
+              <w:jc w:val="center"/>
+              <w:rPr>
+                <w:rFonts w:ascii="Zain" w:hAnsi="Zain" w:cs="Zain"/>
+                <w:lang w:bidi="fa-IR"/>
               </w:rPr>
             </w:pPr>
           </w:p>
         </w:tc>
       </w:tr>
-      <w:tr>
-        <w:tc>
-          <w:tcPr>
-            <w:tcW w:w="5670" w:type="dxa"/>
-            <w:gridSpan w:val="3"/>
-          </w:tcPr>
-          <w:p>
-            <w:pPr>
-              <w:bidi/>
-              <w:rPr>
-                <w:rFonts w:cs="Mj_Casablanca Light"/>
-                <w:color w:val="0070C0"/>
-                <w:rtl/>
-              </w:rPr>
-            </w:pPr>
-          </w:p>
-        </w:tc>
-        <w:tc>
-          <w:tcPr>
-            <w:tcW w:w="5682" w:type="dxa"/>
-            <w:gridSpan w:val="2"/>
-          </w:tcPr>
-          <w:p>
-            <w:pPr>
-              <w:bidi/>
-              <w:rPr>
-                <w:rFonts w:cs="Mj_Casablanca Light"/>
-                <w:color w:val="0070C0"/>
-                <w:rtl/>
-              </w:rPr>
-            </w:pPr>
-          </w:p>
-        </w:tc>
-      </w:tr>
+    </w:tbl>
+    <w:p>
+      <w:pPr>
+        <w:bidi/>
+        <w:rPr>
+          <w:lang w:bidi="fa-IR"/>
+        </w:rPr>
+      </w:pPr>
+    </w:p>
+    <w:tbl>
+      <w:tblPr>
+        <w:tblStyle w:val="TableGrid"/>
+        <w:bidiVisual/>
+        <w:tblW w:w="11352" w:type="dxa"/>
+        <w:tblInd w:w="-996" w:type="dxa"/>
+        <w:tblLook w:val="04A0" w:firstRow="1" w:lastRow="0" w:firstColumn="1" w:lastColumn="0" w:noHBand="0" w:noVBand="1"/>
+      </w:tblPr>
+      <w:tblGrid>
+        <w:gridCol w:w="2715"/>
+        <w:gridCol w:w="8637"/>
+      </w:tblGrid>
       <w:tr>
         <w:tc>
           <w:tcPr>
             <w:tcW w:w="11352" w:type="dxa"/>
-            <w:gridSpan w:val="5"/>
+            <w:gridSpan w:val="2"/>
+            <w:shd w:val="clear" w:color="auto" w:fill="222A35" w:themeFill="text2" w:themeFillShade="80"/>
             <w:vAlign w:val="center"/>
           </w:tcPr>
           <w:p>
             <w:pPr>
               <w:bidi/>
               <w:rPr>
-                <w:rFonts w:cs="Mj_Casablanca Light"/>
+                <w:rFonts w:ascii="Zain" w:hAnsi="Zain" w:cs="Zain"/>
+                <w:b/>
+                <w:bCs/>
                 <w:color w:val="ED7D31" w:themeColor="accent2"/>
                 <w:sz w:val="32"/>
                 <w:szCs w:val="32"/>
                 <w:rtl/>
+                <w:lang w:bidi="fa-IR"/>
               </w:rPr>
             </w:pPr>
             <w:r>
               <w:rPr>
-                <w:rFonts w:cs="Mj_Casablanca Light" w:hint="cs"/>
+                <w:rFonts w:ascii="Zain" w:hAnsi="Zain" w:cs="Zain"/>
+                <w:b/>
+                <w:bCs/>
                 <w:color w:val="ED7D31" w:themeColor="accent2"/>
                 <w:sz w:val="32"/>
                 <w:szCs w:val="32"/>
                 <w:rtl/>
+                <w:lang w:bidi="fa-IR"/>
               </w:rPr>
               <w:t>پشت كارت :</w:t>
             </w:r>
@@ -363,22 +607,27 @@
         <w:tc>
           <w:tcPr>
             <w:tcW w:w="11352" w:type="dxa"/>
-            <w:gridSpan w:val="5"/>
+            <w:gridSpan w:val="2"/>
           </w:tcPr>
           <w:p>
             <w:pPr>
               <w:bidi/>
               <w:rPr>
-                <w:rFonts w:cs="Mj_Casablanca Light"/>
-                <w:color w:val="0070C0"/>
-                <w:rtl/>
+                <w:rFonts w:ascii="Zain" w:hAnsi="Zain" w:cs="Zain"/>
+                <w:b/>
+                <w:bCs/>
+                <w:color w:val="0070C0"/>
+                <w:lang w:bidi="fa-IR"/>
               </w:rPr>
             </w:pPr>
             <w:r>
               <w:rPr>
-                <w:rFonts w:cs="Mj_Casablanca Light" w:hint="cs"/>
-                <w:color w:val="0070C0"/>
-                <w:rtl/>
+                <w:rFonts w:ascii="Zain" w:hAnsi="Zain" w:cs="Zain"/>
+                <w:b/>
+                <w:bCs/>
+                <w:color w:val="0070C0"/>
+                <w:rtl/>
+                <w:lang w:bidi="fa-IR"/>
               </w:rPr>
               <w:t>صفت ها :</w:t>
             </w:r>
@@ -392,53 +641,9 @@
               </w:numPr>
               <w:bidi/>
               <w:rPr>
-                <w:rFonts w:cs="Mj_Casablanca Light"/>
-                <w:color w:val="0070C0"/>
-              </w:rPr>
-            </w:pPr>
-            <w:r>
-              <w:rPr>
-                <w:rFonts w:cs="Mj_Casablanca Light" w:hint="cs"/>
-                <w:color w:val="0070C0"/>
-                <w:rtl/>
-              </w:rPr>
-              <w:t xml:space="preserve">  </w:t>
-            </w:r>
-          </w:p>
-          <w:p>
-            <w:pPr>
-              <w:pStyle w:val="ListParagraph"/>
-              <w:numPr>
-                <w:ilvl w:val="0"/>
-                <w:numId w:val="1"/>
-              </w:numPr>
-              <w:bidi/>
-              <w:rPr>
-                <w:rFonts w:cs="Mj_Casablanca Light"/>
-                <w:color w:val="0070C0"/>
-              </w:rPr>
-            </w:pPr>
-            <w:r>
-              <w:rPr>
-                <w:rFonts w:cs="Mj_Casablanca Light" w:hint="cs"/>
-                <w:color w:val="0070C0"/>
-                <w:rtl/>
-              </w:rPr>
-              <w:t xml:space="preserve">  </w:t>
-            </w:r>
-          </w:p>
-          <w:p>
-            <w:pPr>
-              <w:pStyle w:val="ListParagraph"/>
-              <w:numPr>
-                <w:ilvl w:val="0"/>
-                <w:numId w:val="1"/>
-              </w:numPr>
-              <w:bidi/>
-              <w:rPr>
-                <w:rFonts w:cs="Mj_Casablanca Light"/>
-                <w:color w:val="0070C0"/>
-                <w:rtl/>
+                <w:rFonts w:ascii="Zain" w:hAnsi="Zain" w:cs="Zain"/>
+                <w:rtl/>
+                <w:lang w:bidi="fa-IR"/>
               </w:rPr>
             </w:pPr>
           </w:p>
@@ -448,23 +653,28 @@
         <w:tc>
           <w:tcPr>
             <w:tcW w:w="11352" w:type="dxa"/>
-            <w:gridSpan w:val="5"/>
+            <w:gridSpan w:val="2"/>
             <w:vAlign w:val="center"/>
           </w:tcPr>
           <w:p>
             <w:pPr>
               <w:bidi/>
               <w:rPr>
-                <w:rFonts w:cs="Mj_Casablanca Light"/>
-                <w:color w:val="0070C0"/>
-                <w:rtl/>
+                <w:rFonts w:ascii="Zain" w:hAnsi="Zain" w:cs="Zain"/>
+                <w:b/>
+                <w:bCs/>
+                <w:color w:val="0070C0"/>
+                <w:lang w:bidi="fa-IR"/>
               </w:rPr>
             </w:pPr>
             <w:r>
               <w:rPr>
-                <w:rFonts w:cs="Mj_Casablanca Light" w:hint="cs"/>
-                <w:color w:val="0070C0"/>
-                <w:rtl/>
+                <w:rFonts w:ascii="Zain" w:hAnsi="Zain" w:cs="Zain"/>
+                <w:b/>
+                <w:bCs/>
+                <w:color w:val="0070C0"/>
+                <w:rtl/>
+                <w:lang w:bidi="fa-IR"/>
               </w:rPr>
               <w:t>روابط :</w:t>
             </w:r>
@@ -474,73 +684,91 @@
       <w:tr>
         <w:tc>
           <w:tcPr>
-            <w:tcW w:w="2580" w:type="dxa"/>
+            <w:tcW w:w="2715" w:type="dxa"/>
             <w:vAlign w:val="center"/>
           </w:tcPr>
           <w:p>
             <w:pPr>
               <w:bidi/>
               <w:rPr>
-                <w:rFonts w:cs="Mj_Casablanca Light"/>
-                <w:color w:val="0070C0"/>
-                <w:rtl/>
+                <w:rFonts w:ascii="Zain" w:hAnsi="Zain" w:cs="Zain"/>
+                <w:b/>
+                <w:bCs/>
+                <w:color w:val="0070C0"/>
+                <w:rtl/>
+                <w:lang w:bidi="fa-IR"/>
               </w:rPr>
             </w:pPr>
             <w:r>
               <w:rPr>
-                <w:rFonts w:cs="Mj_Casablanca Light" w:hint="cs"/>
-                <w:color w:val="0070C0"/>
-                <w:rtl/>
-              </w:rPr>
-              <w:t xml:space="preserve">تعميم ( يك </w:t>
-            </w:r>
-            <w:r>
-              <w:rPr>
-                <w:rFonts w:ascii="Arial" w:hAnsi="Arial" w:cs="Arial" w:hint="cs"/>
-                <w:color w:val="0070C0"/>
-                <w:rtl/>
-              </w:rPr>
-              <w:t>–</w:t>
-            </w:r>
-            <w:r>
-              <w:rPr>
-                <w:rFonts w:cs="Mj_Casablanca Light" w:hint="cs"/>
-                <w:color w:val="0070C0"/>
-                <w:rtl/>
-              </w:rPr>
-              <w:t xml:space="preserve"> نوع </w:t>
-            </w:r>
-            <w:r>
-              <w:rPr>
-                <w:rFonts w:ascii="Arial" w:hAnsi="Arial" w:cs="Arial" w:hint="cs"/>
-                <w:color w:val="0070C0"/>
-                <w:rtl/>
-              </w:rPr>
-              <w:t>–</w:t>
-            </w:r>
-            <w:r>
-              <w:rPr>
-                <w:rFonts w:cs="Mj_Casablanca Light" w:hint="cs"/>
-                <w:color w:val="0070C0"/>
-                <w:rtl/>
-              </w:rPr>
-              <w:t xml:space="preserve"> از ) :</w:t>
+                <w:rFonts w:ascii="Zain" w:hAnsi="Zain" w:cs="Zain"/>
+                <w:b/>
+                <w:bCs/>
+                <w:color w:val="0070C0"/>
+                <w:rtl/>
+                <w:lang w:bidi="fa-IR"/>
+              </w:rPr>
+              <w:t>تعم</w:t>
+            </w:r>
+            <w:r>
+              <w:rPr>
+                <w:rFonts w:ascii="Zain" w:hAnsi="Zain" w:cs="Zain"/>
+                <w:b/>
+                <w:bCs/>
+                <w:color w:val="0070C0"/>
+                <w:rtl/>
+                <w:lang w:bidi="fa-IR"/>
+              </w:rPr>
+              <w:t>ی</w:t>
+            </w:r>
+            <w:r>
+              <w:rPr>
+                <w:rFonts w:ascii="Zain" w:hAnsi="Zain" w:cs="Zain"/>
+                <w:b/>
+                <w:bCs/>
+                <w:color w:val="0070C0"/>
+                <w:rtl/>
+                <w:lang w:bidi="fa-IR"/>
+              </w:rPr>
+              <w:t xml:space="preserve">م ( </w:t>
+            </w:r>
+            <w:r>
+              <w:rPr>
+                <w:rFonts w:ascii="Zain" w:hAnsi="Zain" w:cs="Zain"/>
+                <w:b/>
+                <w:bCs/>
+                <w:color w:val="0070C0"/>
+                <w:rtl/>
+                <w:lang w:bidi="fa-IR"/>
+              </w:rPr>
+              <w:t>ی</w:t>
+            </w:r>
+            <w:r>
+              <w:rPr>
+                <w:rFonts w:ascii="Zain" w:hAnsi="Zain" w:cs="Zain"/>
+                <w:b/>
+                <w:bCs/>
+                <w:color w:val="0070C0"/>
+                <w:rtl/>
+                <w:lang w:bidi="fa-IR"/>
+              </w:rPr>
+              <w:t>ك – نوع – از ) :</w:t>
             </w:r>
           </w:p>
         </w:tc>
         <w:tc>
           <w:tcPr>
-            <w:tcW w:w="8772" w:type="dxa"/>
-            <w:gridSpan w:val="4"/>
+            <w:tcW w:w="8637" w:type="dxa"/>
             <w:vAlign w:val="center"/>
           </w:tcPr>
           <w:p>
             <w:pPr>
               <w:bidi/>
               <w:rPr>
-                <w:rFonts w:cs="Mj_Casablanca Light"/>
-                <w:color w:val="0070C0"/>
-                <w:rtl/>
+                <w:rFonts w:ascii="Zain" w:hAnsi="Zain" w:cs="Zain"/>
+                <w:color w:val="0070C0"/>
+                <w:rtl/>
+                <w:lang w:bidi="fa-IR"/>
               </w:rPr>
             </w:pPr>
           </w:p>
@@ -549,57 +777,91 @@
       <w:tr>
         <w:tc>
           <w:tcPr>
-            <w:tcW w:w="2580" w:type="dxa"/>
+            <w:tcW w:w="2715" w:type="dxa"/>
             <w:vAlign w:val="center"/>
           </w:tcPr>
           <w:p>
             <w:pPr>
               <w:bidi/>
               <w:rPr>
-                <w:rFonts w:cs="Mj_Casablanca Light"/>
-                <w:color w:val="0070C0"/>
-                <w:rtl/>
+                <w:rFonts w:ascii="Zain" w:hAnsi="Zain" w:cs="Zain"/>
+                <w:b/>
+                <w:bCs/>
+                <w:color w:val="0070C0"/>
+                <w:rtl/>
+                <w:lang w:bidi="fa-IR"/>
               </w:rPr>
             </w:pPr>
             <w:r>
               <w:rPr>
-                <w:rFonts w:cs="Mj_Casablanca Light" w:hint="cs"/>
-                <w:color w:val="0070C0"/>
-                <w:rtl/>
-              </w:rPr>
-              <w:t xml:space="preserve">تجميع ( داراي </w:t>
-            </w:r>
-            <w:r>
-              <w:rPr>
-                <w:rFonts w:ascii="Arial" w:hAnsi="Arial" w:cs="Arial" w:hint="cs"/>
-                <w:color w:val="0070C0"/>
-                <w:rtl/>
-              </w:rPr>
-              <w:t>–</w:t>
-            </w:r>
-            <w:r>
-              <w:rPr>
-                <w:rFonts w:cs="Mj_Casablanca Light" w:hint="cs"/>
-                <w:color w:val="0070C0"/>
-                <w:rtl/>
-              </w:rPr>
-              <w:t xml:space="preserve"> اجزائ ) :</w:t>
+                <w:rFonts w:ascii="Zain" w:hAnsi="Zain" w:cs="Zain"/>
+                <w:b/>
+                <w:bCs/>
+                <w:color w:val="0070C0"/>
+                <w:rtl/>
+                <w:lang w:bidi="fa-IR"/>
+              </w:rPr>
+              <w:t>تجم</w:t>
+            </w:r>
+            <w:r>
+              <w:rPr>
+                <w:rFonts w:ascii="Zain" w:hAnsi="Zain" w:cs="Zain"/>
+                <w:b/>
+                <w:bCs/>
+                <w:color w:val="0070C0"/>
+                <w:rtl/>
+                <w:lang w:bidi="fa-IR"/>
+              </w:rPr>
+              <w:t>ی</w:t>
+            </w:r>
+            <w:r>
+              <w:rPr>
+                <w:rFonts w:ascii="Zain" w:hAnsi="Zain" w:cs="Zain"/>
+                <w:b/>
+                <w:bCs/>
+                <w:color w:val="0070C0"/>
+                <w:rtl/>
+                <w:lang w:bidi="fa-IR"/>
+              </w:rPr>
+              <w:t>ع ( دارا</w:t>
+            </w:r>
+            <w:r>
+              <w:rPr>
+                <w:rFonts w:ascii="Zain" w:hAnsi="Zain" w:cs="Zain"/>
+                <w:b/>
+                <w:bCs/>
+                <w:color w:val="0070C0"/>
+                <w:rtl/>
+                <w:lang w:bidi="fa-IR"/>
+              </w:rPr>
+              <w:t>ی</w:t>
+            </w:r>
+            <w:r>
+              <w:rPr>
+                <w:rFonts w:ascii="Zain" w:hAnsi="Zain" w:cs="Zain"/>
+                <w:b/>
+                <w:bCs/>
+                <w:color w:val="0070C0"/>
+                <w:rtl/>
+                <w:lang w:bidi="fa-IR"/>
+              </w:rPr>
+              <w:t xml:space="preserve"> – اجزائ ) :</w:t>
             </w:r>
           </w:p>
         </w:tc>
         <w:tc>
           <w:tcPr>
-            <w:tcW w:w="8772" w:type="dxa"/>
-            <w:gridSpan w:val="4"/>
+            <w:tcW w:w="8637" w:type="dxa"/>
             <w:vAlign w:val="center"/>
           </w:tcPr>
           <w:p>
             <w:pPr>
               <w:bidi/>
               <w:rPr>
-                <w:rFonts w:cs="Mj_Casablanca Light"/>
-                <w:color w:val="0070C0"/>
-                <w:rtl/>
+                <w:rFonts w:ascii="Zain" w:hAnsi="Zain" w:cs="Zain"/>
+                <w:color w:val="0070C0"/>
+                <w:rtl/>
+                <w:lang w:bidi="fa-IR"/>
               </w:rPr>
             </w:pPr>
           </w:p>
@@ -608,41 +870,69 @@
       <w:tr>
         <w:tc>
           <w:tcPr>
-            <w:tcW w:w="2580" w:type="dxa"/>
+            <w:tcW w:w="2715" w:type="dxa"/>
             <w:vAlign w:val="center"/>
           </w:tcPr>
           <w:p>
             <w:pPr>
               <w:bidi/>
               <w:rPr>
-                <w:rFonts w:cs="Mj_Casablanca Light"/>
-                <w:color w:val="0070C0"/>
-                <w:rtl/>
+                <w:rFonts w:ascii="Zain" w:hAnsi="Zain" w:cs="Zain"/>
+                <w:b/>
+                <w:bCs/>
+                <w:color w:val="0070C0"/>
+                <w:rtl/>
+                <w:lang w:bidi="fa-IR"/>
               </w:rPr>
             </w:pPr>
             <w:r>
               <w:rPr>
-                <w:rFonts w:cs="Mj_Casablanca Light" w:hint="cs"/>
-                <w:color w:val="0070C0"/>
-                <w:rtl/>
-              </w:rPr>
-              <w:t>ساير روابط :</w:t>
+                <w:rFonts w:ascii="Zain" w:hAnsi="Zain" w:cs="Zain"/>
+                <w:b/>
+                <w:bCs/>
+                <w:color w:val="0070C0"/>
+                <w:rtl/>
+                <w:lang w:bidi="fa-IR"/>
+              </w:rPr>
+              <w:t>سا</w:t>
+            </w:r>
+            <w:r>
+              <w:rPr>
+                <w:rFonts w:ascii="Zain" w:hAnsi="Zain" w:cs="Zain"/>
+                <w:b/>
+                <w:bCs/>
+                <w:color w:val="0070C0"/>
+                <w:rtl/>
+                <w:lang w:bidi="fa-IR"/>
+              </w:rPr>
+              <w:t>ی</w:t>
+            </w:r>
+            <w:r>
+              <w:rPr>
+                <w:rFonts w:ascii="Zain" w:hAnsi="Zain" w:cs="Zain"/>
+                <w:b/>
+                <w:bCs/>
+                <w:color w:val="0070C0"/>
+                <w:rtl/>
+                <w:lang w:bidi="fa-IR"/>
+              </w:rPr>
+              <w:t>ر روابط :</w:t>
             </w:r>
           </w:p>
         </w:tc>
         <w:tc>
           <w:tcPr>
-            <w:tcW w:w="8772" w:type="dxa"/>
-            <w:gridSpan w:val="4"/>
+            <w:tcW w:w="8637" w:type="dxa"/>
             <w:vAlign w:val="center"/>
           </w:tcPr>
           <w:p>
             <w:pPr>
               <w:bidi/>
               <w:rPr>
-                <w:rFonts w:cs="Mj_Casablanca Light"/>
-                <w:color w:val="0070C0"/>
-                <w:rtl/>
+                <w:rFonts w:ascii="Zain" w:hAnsi="Zain" w:cs="Zain"/>
+                <w:color w:val="0070C0"/>
+                <w:rtl/>
+                <w:lang w:bidi="fa-IR"/>
               </w:rPr>
             </w:pPr>
           </w:p>
@@ -653,21 +943,81 @@
       <w:pPr>
         <w:bidi/>
         <w:rPr>
-          <w:rFonts w:cs="Mj_Casablanca Light"/>
-          <w:color w:val="0070C0"/>
-          <w:sz w:val="22"/>
-          <w:szCs w:val="22"/>
+          <w:rtl/>
         </w:rPr>
       </w:pPr>
     </w:p>
+    <w:p>
+      <w:pPr>
+        <w:rPr>
+          <w:rtl/>
+        </w:rPr>
+      </w:pPr>
+      <w:r>
+        <w:rPr>
+          <w:rtl/>
+        </w:rPr>
+        <w:br w:type="page"/>
+      </w:r>
+    </w:p>
     <w:sectPr>
-      <w:pgSz w:w="12240" w:h="15840" w:code="1"/>
+      <w:pgSz w:w="12240" w:h="20160" w:code="5"/>
       <w:pgMar w:top="1440" w:right="1440" w:bottom="1440" w:left="1440" w:header="720" w:footer="720" w:gutter="0"/>
       <w:cols w:space="720"/>
       <w:docGrid w:linePitch="360"/>
     </w:sectPr>
   </w:body>
 </w:document>
+</file>
+
+<file path=word/endnotes.xml><?xml version="1.0" encoding="utf-8"?>
+<w:endnotes xmlns:wpc="http://schemas.microsoft.com/office/word/2010/wordprocessingCanvas" xmlns:cx="http://schemas.microsoft.com/office/drawing/2014/chartex" xmlns:cx1="http://schemas.microsoft.com/office/drawing/2015/9/8/chartex" xmlns:cx2="http://schemas.microsoft.com/office/drawing/2015/10/21/chartex" xmlns:cx3="http://schemas.microsoft.com/office/drawing/2016/5/9/chartex" xmlns:cx4="http://schemas.microsoft.com/office/drawing/2016/5/10/chartex" xmlns:cx5="http://schemas.microsoft.com/office/drawing/2016/5/11/chartex" xmlns:cx6="http://schemas.microsoft.com/office/drawing/2016/5/12/chartex" xmlns:cx7="http://schemas.microsoft.com/office/drawing/2016/5/13/chartex" xmlns:cx8="http://schemas.microsoft.com/office/drawing/2016/5/14/chartex" xmlns:mc="http://schemas.openxmlformats.org/markup-compatibility/2006" xmlns:aink="http://schemas.microsoft.com/office/drawing/2016/ink" xmlns:am3d="http://schemas.microsoft.com/office/drawing/2017/model3d" xmlns:o="urn:schemas-microsoft-com:office:office" xmlns:oel="http://schemas.microsoft.com/office/2019/extlst" xmlns:r="http://schemas.openxmlformats.org/officeDocument/2006/relationships" xmlns:m="http://schemas.openxmlformats.org/officeDocument/2006/math" xmlns:v="urn:schemas-microsoft-com:vml" xmlns:wp14="http://schemas.microsoft.com/office/word/2010/wordprocessingDrawing" xmlns:wp="http://schemas.openxmlformats.org/drawingml/2006/wordprocessingDrawing" xmlns:w10="urn:schemas-microsoft-com:office:word" xmlns:w="http://schemas.openxmlformats.org/wordprocessingml/2006/main" xmlns:w14="http://schemas.microsoft.com/office/word/2010/wordml" xmlns:w15="http://schemas.microsoft.com/office/word/2012/wordml" xmlns:w16cex="http://schemas.microsoft.com/office/word/2018/wordml/cex" xmlns:w16cid="http://schemas.microsoft.com/office/word/2016/wordml/cid" xmlns:w16="http://schemas.microsoft.com/office/word/2018/wordml" xmlns:w16du="http://schemas.microsoft.com/office/word/2023/wordml/word16du" xmlns:w16sdtdh="http://schemas.microsoft.com/office/word/2020/wordml/sdtdatahash" xmlns:w16sdtfl="http://schemas.microsoft.com/office/word/2024/wordml/sdtformatlock" xmlns:w16se="http://schemas.microsoft.com/office/word/2015/wordml/symex" xmlns:wpg="http://schemas.microsoft.com/office/word/2010/wordprocessingGroup" xmlns:wpi="http://schemas.microsoft.com/office/word/2010/wordprocessingInk" xmlns:wne="http://schemas.microsoft.com/office/word/2006/wordml" xmlns:wps="http://schemas.microsoft.com/office/word/2010/wordprocessingShape" mc:Ignorable="w14 w15 w16se w16cid w16 w16cex w16sdtdh w16sdtfl w16du wp14">
+  <w:endnote w:type="separator" w:id="-1">
+    <w:p>
+      <w:pPr>
+        <w:spacing w:after="0" w:line="240" w:lineRule="auto"/>
+      </w:pPr>
+      <w:r>
+        <w:separator/>
+      </w:r>
+    </w:p>
+  </w:endnote>
+  <w:endnote w:type="continuationSeparator" w:id="0">
+    <w:p>
+      <w:pPr>
+        <w:spacing w:after="0" w:line="240" w:lineRule="auto"/>
+      </w:pPr>
+      <w:r>
+        <w:continuationSeparator/>
+      </w:r>
+    </w:p>
+  </w:endnote>
+</w:endnotes>
+</file>
+
+<file path=word/footnotes.xml><?xml version="1.0" encoding="utf-8"?>
+<w:footnotes xmlns:wpc="http://schemas.microsoft.com/office/word/2010/wordprocessingCanvas" xmlns:cx="http://schemas.microsoft.com/office/drawing/2014/chartex" xmlns:cx1="http://schemas.microsoft.com/office/drawing/2015/9/8/chartex" xmlns:cx2="http://schemas.microsoft.com/office/drawing/2015/10/21/chartex" xmlns:cx3="http://schemas.microsoft.com/office/drawing/2016/5/9/chartex" xmlns:cx4="http://schemas.microsoft.com/office/drawing/2016/5/10/chartex" xmlns:cx5="http://schemas.microsoft.com/office/drawing/2016/5/11/chartex" xmlns:cx6="http://schemas.microsoft.com/office/drawing/2016/5/12/chartex" xmlns:cx7="http://schemas.microsoft.com/office/drawing/2016/5/13/chartex" xmlns:cx8="http://schemas.microsoft.com/office/drawing/2016/5/14/chartex" xmlns:mc="http://schemas.openxmlformats.org/markup-compatibility/2006" xmlns:aink="http://schemas.microsoft.com/office/drawing/2016/ink" xmlns:am3d="http://schemas.microsoft.com/office/drawing/2017/model3d" xmlns:o="urn:schemas-microsoft-com:office:office" xmlns:oel="http://schemas.microsoft.com/office/2019/extlst" xmlns:r="http://schemas.openxmlformats.org/officeDocument/2006/relationships" xmlns:m="http://schemas.openxmlformats.org/officeDocument/2006/math" xmlns:v="urn:schemas-microsoft-com:vml" xmlns:wp14="http://schemas.microsoft.com/office/word/2010/wordprocessingDrawing" xmlns:wp="http://schemas.openxmlformats.org/drawingml/2006/wordprocessingDrawing" xmlns:w10="urn:schemas-microsoft-com:office:word" xmlns:w="http://schemas.openxmlformats.org/wordprocessingml/2006/main" xmlns:w14="http://schemas.microsoft.com/office/word/2010/wordml" xmlns:w15="http://schemas.microsoft.com/office/word/2012/wordml" xmlns:w16cex="http://schemas.microsoft.com/office/word/2018/wordml/cex" xmlns:w16cid="http://schemas.microsoft.com/office/word/2016/wordml/cid" xmlns:w16="http://schemas.microsoft.com/office/word/2018/wordml" xmlns:w16du="http://schemas.microsoft.com/office/word/2023/wordml/word16du" xmlns:w16sdtdh="http://schemas.microsoft.com/office/word/2020/wordml/sdtdatahash" xmlns:w16sdtfl="http://schemas.microsoft.com/office/word/2024/wordml/sdtformatlock" xmlns:w16se="http://schemas.microsoft.com/office/word/2015/wordml/symex" xmlns:wpg="http://schemas.microsoft.com/office/word/2010/wordprocessingGroup" xmlns:wpi="http://schemas.microsoft.com/office/word/2010/wordprocessingInk" xmlns:wne="http://schemas.microsoft.com/office/word/2006/wordml" xmlns:wps="http://schemas.microsoft.com/office/word/2010/wordprocessingShape" mc:Ignorable="w14 w15 w16se w16cid w16 w16cex w16sdtdh w16sdtfl w16du wp14">
+  <w:footnote w:type="separator" w:id="-1">
+    <w:p>
+      <w:pPr>
+        <w:spacing w:after="0" w:line="240" w:lineRule="auto"/>
+      </w:pPr>
+      <w:r>
+        <w:separator/>
+      </w:r>
+    </w:p>
+  </w:footnote>
+  <w:footnote w:type="continuationSeparator" w:id="0">
+    <w:p>
+      <w:pPr>
+        <w:spacing w:after="0" w:line="240" w:lineRule="auto"/>
+      </w:pPr>
+      <w:r>
+        <w:continuationSeparator/>
+      </w:r>
+    </w:p>
+  </w:footnote>
+</w:footnotes>
 </file>
 
 <file path=word/numbering.xml><?xml version="1.0" encoding="utf-8"?>
@@ -1191,6 +1541,7 @@
   <w:style w:type="paragraph" w:default="1" w:styleId="Normal">
     <w:name w:val="Normal"/>
     <w:qFormat/>
+    <w:rsid w:val="006D5369"/>
   </w:style>
   <w:style w:type="paragraph" w:styleId="Heading1">
     <w:name w:val="heading 1"/>
@@ -1394,6 +1745,7 @@
   <w:style w:type="character" w:default="1" w:styleId="DefaultParagraphFont">
     <w:name w:val="Default Paragraph Font"/>
     <w:uiPriority w:val="1"/>
+    <w:semiHidden/>
     <w:unhideWhenUsed/>
   </w:style>
   <w:style w:type="table" w:default="1" w:styleId="TableNormal">
@@ -1725,6 +2077,167 @@
         <w:insideV w:val="single" w:sz="4" w:space="0" w:color="auto"/>
       </w:tblBorders>
     </w:tblPr>
+  </w:style>
+  <w:style w:type="paragraph" w:styleId="Revision">
+    <w:name w:val="Revision"/>
+    <w:hidden/>
+    <w:uiPriority w:val="99"/>
+    <w:semiHidden/>
+    <w:rsid w:val="001B3922"/>
+    <w:pPr>
+      <w:spacing w:after="0" w:line="240" w:lineRule="auto"/>
+    </w:pPr>
+  </w:style>
+  <w:style w:type="character" w:styleId="CommentReference">
+    <w:name w:val="annotation reference"/>
+    <w:basedOn w:val="DefaultParagraphFont"/>
+    <w:uiPriority w:val="99"/>
+    <w:semiHidden/>
+    <w:unhideWhenUsed/>
+    <w:rsid w:val="001B3922"/>
+    <w:rPr>
+      <w:sz w:val="16"/>
+      <w:szCs w:val="16"/>
+    </w:rPr>
+  </w:style>
+  <w:style w:type="paragraph" w:styleId="CommentText">
+    <w:name w:val="annotation text"/>
+    <w:basedOn w:val="Normal"/>
+    <w:link w:val="CommentTextChar"/>
+    <w:uiPriority w:val="99"/>
+    <w:semiHidden/>
+    <w:unhideWhenUsed/>
+    <w:rsid w:val="001B3922"/>
+    <w:pPr>
+      <w:spacing w:line="240" w:lineRule="auto"/>
+    </w:pPr>
+    <w:rPr>
+      <w:sz w:val="20"/>
+      <w:szCs w:val="20"/>
+    </w:rPr>
+  </w:style>
+  <w:style w:type="character" w:customStyle="1" w:styleId="CommentTextChar">
+    <w:name w:val="Comment Text Char"/>
+    <w:basedOn w:val="DefaultParagraphFont"/>
+    <w:link w:val="CommentText"/>
+    <w:uiPriority w:val="99"/>
+    <w:semiHidden/>
+    <w:rsid w:val="001B3922"/>
+    <w:rPr>
+      <w:sz w:val="20"/>
+      <w:szCs w:val="20"/>
+    </w:rPr>
+  </w:style>
+  <w:style w:type="paragraph" w:styleId="CommentSubject">
+    <w:name w:val="annotation subject"/>
+    <w:basedOn w:val="CommentText"/>
+    <w:next w:val="CommentText"/>
+    <w:link w:val="CommentSubjectChar"/>
+    <w:uiPriority w:val="99"/>
+    <w:semiHidden/>
+    <w:unhideWhenUsed/>
+    <w:rsid w:val="001B3922"/>
+    <w:rPr>
+      <w:b/>
+      <w:bCs/>
+    </w:rPr>
+  </w:style>
+  <w:style w:type="character" w:customStyle="1" w:styleId="CommentSubjectChar">
+    <w:name w:val="Comment Subject Char"/>
+    <w:basedOn w:val="CommentTextChar"/>
+    <w:link w:val="CommentSubject"/>
+    <w:uiPriority w:val="99"/>
+    <w:semiHidden/>
+    <w:rsid w:val="001B3922"/>
+    <w:rPr>
+      <w:b/>
+      <w:bCs/>
+      <w:sz w:val="20"/>
+      <w:szCs w:val="20"/>
+    </w:rPr>
+  </w:style>
+  <w:style w:type="paragraph" w:styleId="FootnoteText">
+    <w:name w:val="footnote text"/>
+    <w:basedOn w:val="Normal"/>
+    <w:link w:val="FootnoteTextChar"/>
+    <w:uiPriority w:val="99"/>
+    <w:semiHidden/>
+    <w:unhideWhenUsed/>
+    <w:rsid w:val="006208E2"/>
+    <w:pPr>
+      <w:spacing w:after="0" w:line="240" w:lineRule="auto"/>
+    </w:pPr>
+    <w:rPr>
+      <w:sz w:val="20"/>
+      <w:szCs w:val="20"/>
+    </w:rPr>
+  </w:style>
+  <w:style w:type="character" w:customStyle="1" w:styleId="FootnoteTextChar">
+    <w:name w:val="Footnote Text Char"/>
+    <w:basedOn w:val="DefaultParagraphFont"/>
+    <w:link w:val="FootnoteText"/>
+    <w:uiPriority w:val="99"/>
+    <w:semiHidden/>
+    <w:rsid w:val="006208E2"/>
+    <w:rPr>
+      <w:sz w:val="20"/>
+      <w:szCs w:val="20"/>
+    </w:rPr>
+  </w:style>
+  <w:style w:type="character" w:styleId="FootnoteReference">
+    <w:name w:val="footnote reference"/>
+    <w:basedOn w:val="DefaultParagraphFont"/>
+    <w:uiPriority w:val="99"/>
+    <w:semiHidden/>
+    <w:unhideWhenUsed/>
+    <w:rsid w:val="006208E2"/>
+    <w:rPr>
+      <w:vertAlign w:val="superscript"/>
+    </w:rPr>
+  </w:style>
+  <w:style w:type="paragraph" w:styleId="Header">
+    <w:name w:val="header"/>
+    <w:basedOn w:val="Normal"/>
+    <w:link w:val="HeaderChar"/>
+    <w:uiPriority w:val="99"/>
+    <w:unhideWhenUsed/>
+    <w:rsid w:val="006D5369"/>
+    <w:pPr>
+      <w:tabs>
+        <w:tab w:val="center" w:pos="4680"/>
+        <w:tab w:val="right" w:pos="9360"/>
+      </w:tabs>
+      <w:spacing w:after="0" w:line="240" w:lineRule="auto"/>
+    </w:pPr>
+  </w:style>
+  <w:style w:type="character" w:customStyle="1" w:styleId="HeaderChar">
+    <w:name w:val="Header Char"/>
+    <w:basedOn w:val="DefaultParagraphFont"/>
+    <w:link w:val="Header"/>
+    <w:uiPriority w:val="99"/>
+    <w:rsid w:val="006D5369"/>
+  </w:style>
+  <w:style w:type="paragraph" w:styleId="Footer">
+    <w:name w:val="footer"/>
+    <w:basedOn w:val="Normal"/>
+    <w:link w:val="FooterChar"/>
+    <w:uiPriority w:val="99"/>
+    <w:unhideWhenUsed/>
+    <w:rsid w:val="006D5369"/>
+    <w:pPr>
+      <w:tabs>
+        <w:tab w:val="center" w:pos="4680"/>
+        <w:tab w:val="right" w:pos="9360"/>
+      </w:tabs>
+      <w:spacing w:after="0" w:line="240" w:lineRule="auto"/>
+    </w:pPr>
+  </w:style>
+  <w:style w:type="character" w:customStyle="1" w:styleId="FooterChar">
+    <w:name w:val="Footer Char"/>
+    <w:basedOn w:val="DefaultParagraphFont"/>
+    <w:link w:val="Footer"/>
+    <w:uiPriority w:val="99"/>
+    <w:rsid w:val="006D5369"/>
   </w:style>
 </w:styles>
 </file>

</xml_diff>